<commit_message>
Corrección de título en documentos de respuesta (acelerógrafo y termocupla)
</commit_message>
<xml_diff>
--- a/RESPUESTA_CONTRATISTA/ACELEROGRAFO/respuesta_acelerografo.docx
+++ b/RESPUESTA_CONTRATISTA/ACELEROGRAFO/respuesta_acelerografo.docx
@@ -34,7 +34,7 @@
           <w:color w:val="auto"/>
           <w:lang w:val="es-EC"/>
         </w:rPr>
-        <w:t>Termocuplas</w:t>
+        <w:t>Aceler</w:t>
       </w:r>
       <w:r>
         <w:rPr>
@@ -42,7 +42,7 @@
           <w:color w:val="auto"/>
           <w:lang w:val="es-EC"/>
         </w:rPr>
-        <w:t xml:space="preserve"> (Ítem </w:t>
+        <w:t>ó</w:t>
       </w:r>
       <w:r>
         <w:rPr>
@@ -50,7 +50,7 @@
           <w:color w:val="auto"/>
           <w:lang w:val="es-EC"/>
         </w:rPr>
-        <w:t>67</w:t>
+        <w:t>grafo</w:t>
       </w:r>
       <w:r>
         <w:rPr>
@@ -58,7 +58,7 @@
           <w:color w:val="auto"/>
           <w:lang w:val="es-EC"/>
         </w:rPr>
-        <w:t>)</w:t>
+        <w:t xml:space="preserve"> </w:t>
       </w:r>
     </w:p>
     <w:p>
@@ -90,7 +90,7 @@
           <w:rFonts w:ascii="Times New Roman" w:hAnsi="Times New Roman" w:cs="Times New Roman"/>
           <w:lang w:val="es-EC"/>
         </w:rPr>
-        <w:t>Digitalizador</w:t>
+        <w:t>Acelerógrafo</w:t>
       </w:r>
     </w:p>
     <w:p>
@@ -120,7 +120,21 @@
           <w:rFonts w:ascii="Times New Roman" w:hAnsi="Times New Roman" w:cs="Times New Roman"/>
           <w:lang w:val="es-EC"/>
         </w:rPr>
-        <w:t>Circuito impreso para termocuplas</w:t>
+        <w:t xml:space="preserve">Circuito impreso para </w:t>
+      </w:r>
+      <w:r>
+        <w:rPr>
+          <w:rFonts w:ascii="Times New Roman" w:hAnsi="Times New Roman" w:cs="Times New Roman"/>
+          <w:lang w:val="es-EC"/>
+        </w:rPr>
+        <w:t>Acelerógrafo</w:t>
+      </w:r>
+      <w:r>
+        <w:rPr>
+          <w:rFonts w:ascii="Times New Roman" w:hAnsi="Times New Roman" w:cs="Times New Roman"/>
+          <w:lang w:val="es-EC"/>
+        </w:rPr>
+        <w:t xml:space="preserve"> </w:t>
       </w:r>
     </w:p>
     <w:p>
@@ -146,19 +160,11 @@
           <w:rFonts w:ascii="Times New Roman" w:hAnsi="Times New Roman" w:cs="Times New Roman"/>
         </w:rPr>
       </w:pPr>
-      <w:proofErr w:type="spellStart"/>
-      <w:r>
-        <w:rPr>
-          <w:rFonts w:ascii="Times New Roman" w:hAnsi="Times New Roman" w:cs="Times New Roman"/>
-        </w:rPr>
-        <w:t>Fecha</w:t>
-      </w:r>
-      <w:proofErr w:type="spellEnd"/>
-      <w:r>
-        <w:rPr>
-          <w:rFonts w:ascii="Times New Roman" w:hAnsi="Times New Roman" w:cs="Times New Roman"/>
-        </w:rPr>
-        <w:t>: 2026-01-06</w:t>
+      <w:r>
+        <w:rPr>
+          <w:rFonts w:ascii="Times New Roman" w:hAnsi="Times New Roman" w:cs="Times New Roman"/>
+        </w:rPr>
+        <w:t>Fecha: 2026-01-06</w:t>
       </w:r>
     </w:p>
     <w:p>
@@ -358,23 +364,7 @@
           <w:rFonts w:ascii="Times New Roman" w:hAnsi="Times New Roman" w:cs="Times New Roman"/>
           <w:lang w:val="es-EC"/>
         </w:rPr>
-        <w:t xml:space="preserve"> y contraste con los requisitos funcionales del sistema (</w:t>
-      </w:r>
-      <w:proofErr w:type="spellStart"/>
-      <w:r>
-        <w:rPr>
-          <w:rFonts w:ascii="Times New Roman" w:hAnsi="Times New Roman" w:cs="Times New Roman"/>
-          <w:lang w:val="es-EC"/>
-        </w:rPr>
-        <w:t>sensado</w:t>
-      </w:r>
-      <w:proofErr w:type="spellEnd"/>
-      <w:r>
-        <w:rPr>
-          <w:rFonts w:ascii="Times New Roman" w:hAnsi="Times New Roman" w:cs="Times New Roman"/>
-          <w:lang w:val="es-EC"/>
-        </w:rPr>
-        <w:t>, control, sincronización, comunicación e integración con unidad de gestión tipo Raspberry Pi).</w:t>
+        <w:t xml:space="preserve"> y contraste con los requisitos funcionales del sistema (sensado, control, sincronización, comunicación e integración con unidad de gestión tipo Raspberry Pi).</w:t>
       </w:r>
     </w:p>
     <w:p>
@@ -811,19 +801,8 @@
           <w:bCs/>
           <w:lang w:val="es-EC"/>
         </w:rPr>
-        <w:t xml:space="preserve">tarjeta auxiliar de control de conmutación y </w:t>
-      </w:r>
-      <w:proofErr w:type="spellStart"/>
-      <w:r>
-        <w:rPr>
-          <w:rFonts w:ascii="Times New Roman" w:hAnsi="Times New Roman" w:cs="Times New Roman"/>
-          <w:b/>
-          <w:bCs/>
-          <w:lang w:val="es-EC"/>
-        </w:rPr>
-        <w:t>sensado</w:t>
-      </w:r>
-      <w:proofErr w:type="spellEnd"/>
+        <w:t>tarjeta auxiliar de control de conmutación y sensado</w:t>
+      </w:r>
       <w:r>
         <w:rPr>
           <w:rFonts w:ascii="Times New Roman" w:hAnsi="Times New Roman" w:cs="Times New Roman"/>
@@ -2029,9 +2008,9 @@
           <w:szCs w:val="24"/>
           <w:lang w:val="es-EC"/>
         </w:rPr>
-        <w:t xml:space="preserve">Aislamiento de dominios de alimentación no evidenciado. No se observa una rama dedicada (por ejemplo 3V3_SENS) con ferrita y </w:t>
-      </w:r>
-      <w:proofErr w:type="spellStart"/>
+        <w:t xml:space="preserve">Aislamiento de dominios de alimentación no evidenciado. No se observa una rama dedicada (por </w:t>
+      </w:r>
+      <w:proofErr w:type="gramStart"/>
       <w:r>
         <w:rPr>
           <w:rFonts w:ascii="Times New Roman" w:hAnsi="Times New Roman" w:cs="Times New Roman"/>
@@ -2043,9 +2022,9 @@
           <w:szCs w:val="24"/>
           <w:lang w:val="es-EC"/>
         </w:rPr>
-        <w:t>desacoplos</w:t>
-      </w:r>
-      <w:proofErr w:type="spellEnd"/>
+        <w:t>ejemplo</w:t>
+      </w:r>
+      <w:proofErr w:type="gramEnd"/>
       <w:r>
         <w:rPr>
           <w:rFonts w:ascii="Times New Roman" w:hAnsi="Times New Roman" w:cs="Times New Roman"/>
@@ -2057,8 +2036,9 @@
           <w:szCs w:val="24"/>
           <w:lang w:val="es-EC"/>
         </w:rPr>
-        <w:t xml:space="preserve"> locales para el ADXL355Z, separada del dominio digital.</w:t>
-      </w:r>
+        <w:t xml:space="preserve"> 3V3_SENS) con ferrita y </w:t>
+      </w:r>
+      <w:proofErr w:type="spellStart"/>
       <w:r>
         <w:rPr>
           <w:rFonts w:ascii="Times New Roman" w:hAnsi="Times New Roman" w:cs="Times New Roman"/>
@@ -2070,13 +2050,10 @@
           <w:szCs w:val="24"/>
           <w:lang w:val="es-EC"/>
         </w:rPr>
-        <w:t>”</w:t>
-      </w:r>
-    </w:p>
-    <w:p>
-      <w:pPr>
-        <w:ind w:left="360"/>
-        <w:jc w:val="both"/>
+        <w:t>desacoplos</w:t>
+      </w:r>
+      <w:proofErr w:type="spellEnd"/>
+      <w:r>
         <w:rPr>
           <w:rFonts w:ascii="Times New Roman" w:hAnsi="Times New Roman" w:cs="Times New Roman"/>
           <w:b/>
@@ -2087,7 +2064,8 @@
           <w:szCs w:val="24"/>
           <w:lang w:val="es-EC"/>
         </w:rPr>
-      </w:pPr>
+        <w:t xml:space="preserve"> locales para el ADXL355Z, separada del dominio digital.</w:t>
+      </w:r>
       <w:r>
         <w:rPr>
           <w:rFonts w:ascii="Times New Roman" w:hAnsi="Times New Roman" w:cs="Times New Roman"/>
@@ -2099,9 +2077,13 @@
           <w:szCs w:val="24"/>
           <w:lang w:val="es-EC"/>
         </w:rPr>
-        <w:t>Respuesta</w:t>
-      </w:r>
-      <w:r>
+        <w:t>”</w:t>
+      </w:r>
+    </w:p>
+    <w:p>
+      <w:pPr>
+        <w:ind w:left="360"/>
+        <w:jc w:val="both"/>
         <w:rPr>
           <w:rFonts w:ascii="Times New Roman" w:hAnsi="Times New Roman" w:cs="Times New Roman"/>
           <w:b/>
@@ -2112,6 +2094,31 @@
           <w:szCs w:val="24"/>
           <w:lang w:val="es-EC"/>
         </w:rPr>
+      </w:pPr>
+      <w:r>
+        <w:rPr>
+          <w:rFonts w:ascii="Times New Roman" w:hAnsi="Times New Roman" w:cs="Times New Roman"/>
+          <w:b/>
+          <w:bCs/>
+          <w:smallCaps/>
+          <w:spacing w:val="5"/>
+          <w:sz w:val="24"/>
+          <w:szCs w:val="24"/>
+          <w:lang w:val="es-EC"/>
+        </w:rPr>
+        <w:t>Respuesta</w:t>
+      </w:r>
+      <w:r>
+        <w:rPr>
+          <w:rFonts w:ascii="Times New Roman" w:hAnsi="Times New Roman" w:cs="Times New Roman"/>
+          <w:b/>
+          <w:bCs/>
+          <w:smallCaps/>
+          <w:spacing w:val="5"/>
+          <w:sz w:val="24"/>
+          <w:szCs w:val="24"/>
+          <w:lang w:val="es-EC"/>
+        </w:rPr>
         <w:t>:</w:t>
       </w:r>
     </w:p>
@@ -2220,23 +2227,7 @@
           <w:rFonts w:ascii="Times New Roman" w:hAnsi="Times New Roman" w:cs="Times New Roman"/>
           <w:lang w:val="es-EC"/>
         </w:rPr>
-        <w:t xml:space="preserve"> asociados al pin de alimentación del sensor, por lo que el aislamiento funcional del dominio de </w:t>
-      </w:r>
-      <w:proofErr w:type="spellStart"/>
-      <w:r>
-        <w:rPr>
-          <w:rFonts w:ascii="Times New Roman" w:hAnsi="Times New Roman" w:cs="Times New Roman"/>
-          <w:lang w:val="es-EC"/>
-        </w:rPr>
-        <w:t>sensado</w:t>
-      </w:r>
-      <w:proofErr w:type="spellEnd"/>
-      <w:r>
-        <w:rPr>
-          <w:rFonts w:ascii="Times New Roman" w:hAnsi="Times New Roman" w:cs="Times New Roman"/>
-          <w:lang w:val="es-EC"/>
-        </w:rPr>
-        <w:t xml:space="preserve"> </w:t>
+        <w:t xml:space="preserve"> asociados al pin de alimentación del sensor, por lo que el aislamiento funcional del dominio de sensado </w:t>
       </w:r>
       <w:r>
         <w:rPr>
@@ -2383,9 +2374,9 @@
           <w:szCs w:val="24"/>
           <w:lang w:val="es-EC"/>
         </w:rPr>
-        <w:t xml:space="preserve">Aislamiento de dominios de alimentación no evidenciado. No se observa una rama dedicada (por ejemplo 3V3_SENS) con ferrita y </w:t>
-      </w:r>
-      <w:proofErr w:type="spellStart"/>
+        <w:t xml:space="preserve">Aislamiento de dominios de alimentación no evidenciado. No se observa una rama dedicada (por </w:t>
+      </w:r>
+      <w:proofErr w:type="gramStart"/>
       <w:r>
         <w:rPr>
           <w:rFonts w:ascii="Times New Roman" w:hAnsi="Times New Roman" w:cs="Times New Roman"/>
@@ -2397,9 +2388,9 @@
           <w:szCs w:val="24"/>
           <w:lang w:val="es-EC"/>
         </w:rPr>
-        <w:t>desacoplos</w:t>
-      </w:r>
-      <w:proofErr w:type="spellEnd"/>
+        <w:t>ejemplo</w:t>
+      </w:r>
+      <w:proofErr w:type="gramEnd"/>
       <w:r>
         <w:rPr>
           <w:rFonts w:ascii="Times New Roman" w:hAnsi="Times New Roman" w:cs="Times New Roman"/>
@@ -2411,8 +2402,9 @@
           <w:szCs w:val="24"/>
           <w:lang w:val="es-EC"/>
         </w:rPr>
-        <w:t xml:space="preserve"> locales para el ADXL355Z, separada del dominio digital.</w:t>
-      </w:r>
+        <w:t xml:space="preserve"> 3V3_SENS) con ferrita y </w:t>
+      </w:r>
+      <w:proofErr w:type="spellStart"/>
       <w:r>
         <w:rPr>
           <w:rFonts w:ascii="Times New Roman" w:hAnsi="Times New Roman" w:cs="Times New Roman"/>
@@ -2424,13 +2416,10 @@
           <w:szCs w:val="24"/>
           <w:lang w:val="es-EC"/>
         </w:rPr>
-        <w:t>”</w:t>
-      </w:r>
-    </w:p>
-    <w:p>
-      <w:pPr>
-        <w:ind w:left="360"/>
-        <w:jc w:val="both"/>
+        <w:t>desacoplos</w:t>
+      </w:r>
+      <w:proofErr w:type="spellEnd"/>
+      <w:r>
         <w:rPr>
           <w:rFonts w:ascii="Times New Roman" w:hAnsi="Times New Roman" w:cs="Times New Roman"/>
           <w:b/>
@@ -2441,7 +2430,8 @@
           <w:szCs w:val="24"/>
           <w:lang w:val="es-EC"/>
         </w:rPr>
-      </w:pPr>
+        <w:t xml:space="preserve"> locales para el ADXL355Z, separada del dominio digital.</w:t>
+      </w:r>
       <w:r>
         <w:rPr>
           <w:rFonts w:ascii="Times New Roman" w:hAnsi="Times New Roman" w:cs="Times New Roman"/>
@@ -2453,9 +2443,13 @@
           <w:szCs w:val="24"/>
           <w:lang w:val="es-EC"/>
         </w:rPr>
-        <w:t>Respuesta</w:t>
-      </w:r>
-      <w:r>
+        <w:t>”</w:t>
+      </w:r>
+    </w:p>
+    <w:p>
+      <w:pPr>
+        <w:ind w:left="360"/>
+        <w:jc w:val="both"/>
         <w:rPr>
           <w:rFonts w:ascii="Times New Roman" w:hAnsi="Times New Roman" w:cs="Times New Roman"/>
           <w:b/>
@@ -2466,6 +2460,31 @@
           <w:szCs w:val="24"/>
           <w:lang w:val="es-EC"/>
         </w:rPr>
+      </w:pPr>
+      <w:r>
+        <w:rPr>
+          <w:rFonts w:ascii="Times New Roman" w:hAnsi="Times New Roman" w:cs="Times New Roman"/>
+          <w:b/>
+          <w:bCs/>
+          <w:smallCaps/>
+          <w:spacing w:val="5"/>
+          <w:sz w:val="24"/>
+          <w:szCs w:val="24"/>
+          <w:lang w:val="es-EC"/>
+        </w:rPr>
+        <w:t>Respuesta</w:t>
+      </w:r>
+      <w:r>
+        <w:rPr>
+          <w:rFonts w:ascii="Times New Roman" w:hAnsi="Times New Roman" w:cs="Times New Roman"/>
+          <w:b/>
+          <w:bCs/>
+          <w:smallCaps/>
+          <w:spacing w:val="5"/>
+          <w:sz w:val="24"/>
+          <w:szCs w:val="24"/>
+          <w:lang w:val="es-EC"/>
+        </w:rPr>
         <w:t>:</w:t>
       </w:r>
     </w:p>
@@ -2558,33 +2577,7 @@
           <w:spacing w:val="0"/>
           <w:lang w:val="es-EC"/>
         </w:rPr>
-        <w:t>Con base en la Nota Técnica de revisión y en las Recomendaciones EMC entregadas, se concluye que el diseño del Acelerógrafo V2 presenta una arquitectura coherente para la función crítica del sistema (</w:t>
-      </w:r>
-      <w:proofErr w:type="spellStart"/>
-      <w:r>
-        <w:rPr>
-          <w:rStyle w:val="Ttulodellibro"/>
-          <w:rFonts w:ascii="Times New Roman" w:hAnsi="Times New Roman" w:cs="Times New Roman"/>
-          <w:b w:val="0"/>
-          <w:bCs w:val="0"/>
-          <w:smallCaps w:val="0"/>
-          <w:spacing w:val="0"/>
-          <w:lang w:val="es-EC"/>
-        </w:rPr>
-        <w:t>sensado</w:t>
-      </w:r>
-      <w:proofErr w:type="spellEnd"/>
-      <w:r>
-        <w:rPr>
-          <w:rStyle w:val="Ttulodellibro"/>
-          <w:rFonts w:ascii="Times New Roman" w:hAnsi="Times New Roman" w:cs="Times New Roman"/>
-          <w:b w:val="0"/>
-          <w:bCs w:val="0"/>
-          <w:smallCaps w:val="0"/>
-          <w:spacing w:val="0"/>
-          <w:lang w:val="es-EC"/>
-        </w:rPr>
-        <w:t xml:space="preserve">, control y sincronización GPS/RTC), y constituye una base técnica válida para avanzar a la etapa de integración y pruebas. Las observaciones levantadas se concentran </w:t>
+        <w:t xml:space="preserve">Con base en la Nota Técnica de revisión y en las Recomendaciones EMC entregadas, se concluye que el diseño del Acelerógrafo V2 presenta una arquitectura coherente para la función crítica del sistema (sensado, control y sincronización GPS/RTC), y constituye una base técnica válida para avanzar a la etapa de integración y pruebas. Las observaciones levantadas se concentran </w:t>
       </w:r>
       <w:r>
         <w:rPr>
@@ -7055,6 +7048,7 @@
   <w:style w:type="character" w:default="1" w:styleId="Fuentedeprrafopredeter">
     <w:name w:val="Default Paragraph Font"/>
     <w:uiPriority w:val="1"/>
+    <w:semiHidden/>
     <w:unhideWhenUsed/>
   </w:style>
   <w:style w:type="table" w:default="1" w:styleId="Tablanormal">

</xml_diff>